<commit_message>
Reframe for Database (Oxford): KG resource focus, coverage-gap as primary contribution, benchmark as validation
</commit_message>
<xml_diff>
--- a/submission/cover_letter.docx
+++ b/submission/cover_letter.docx
@@ -2,7 +2,7 @@
 <file path=word/document.xml><?xml version="1.0" encoding="utf-8"?>
 <w:document xmlns:w="http://schemas.openxmlformats.org/wordprocessingml/2006/main" xmlns:m="http://schemas.openxmlformats.org/officeDocument/2006/math" xmlns:r="http://schemas.openxmlformats.org/officeDocument/2006/relationships" xmlns:o="urn:schemas-microsoft-com:office:office" xmlns:v="urn:schemas-microsoft-com:vml" xmlns:w10="urn:schemas-microsoft-com:office:word" xmlns:a="http://schemas.openxmlformats.org/drawingml/2006/main" xmlns:pic="http://schemas.openxmlformats.org/drawingml/2006/picture" xmlns:wp="http://schemas.openxmlformats.org/drawingml/2006/wordprocessingDrawing">
   <w:body>
-    <w:bookmarkStart w:id="21" w:name="cover-letter"/>
+    <w:bookmarkStart w:id="20" w:name="cover-letter"/>
     <w:p>
       <w:pPr>
         <w:pStyle w:val="Heading1"/>
@@ -26,7 +26,7 @@
         <w:t xml:space="preserve"> </w:t>
       </w:r>
       <w:r>
-        <w:t xml:space="preserve">July 16, 2026</w:t>
+        <w:t xml:space="preserve">July 17, 2026</w:t>
       </w:r>
     </w:p>
     <w:p>
@@ -54,7 +54,7 @@
           <w:i/>
           <w:iCs/>
         </w:rPr>
-        <w:t xml:space="preserve">Journal of Biomedical Informatics</w:t>
+        <w:t xml:space="preserve">Database: The Journal of Biological Databases and Curation</w:t>
       </w:r>
     </w:p>
     <w:p>
@@ -72,13 +72,7 @@
         <w:t xml:space="preserve"> </w:t>
       </w:r>
       <w:r>
-        <w:t xml:space="preserve">Yongxin Yang </w:t>
-      </w:r>
-      <w:r>
-        <w:rPr>
-          <w:rFonts w:hint="eastAsia"/>
-        </w:rPr>
-        <w:t xml:space="preserve">(杨永新)</w:t>
+        <w:t xml:space="preserve">Yongxin Yang</w:t>
       </w:r>
       <w:r>
         <w:t xml:space="preserve"> </w:t>
@@ -135,13 +129,13 @@
           <w:b/>
           <w:bCs/>
         </w:rPr>
-        <w:t xml:space="preserve">“Domain-Specific versus Dense Knowledge Graphs for Gene Perturbation Prediction: A Multi-Split Ablation Benchmark”</w:t>
+        <w:t xml:space="preserve">“RA-PainKG: Construction, Coverage-Gap Documentation, and Benchmark Validation of a Tissue-Contextualized Knowledge Graph for Rheumatoid Arthritis Pain Signaling”</w:t>
       </w:r>
       <w:r>
         <w:t xml:space="preserve"> </w:t>
       </w:r>
       <w:r>
-        <w:t xml:space="preserve">for consideration for publication in the</w:t>
+        <w:t xml:space="preserve">for consideration for publication in</w:t>
       </w:r>
       <w:r>
         <w:t xml:space="preserve"> </w:t>
@@ -151,7 +145,7 @@
           <w:i/>
           <w:iCs/>
         </w:rPr>
-        <w:t xml:space="preserve">Journal of Biomedical Informatics</w:t>
+        <w:t xml:space="preserve">Database: The Journal of Biological Databases and Curation</w:t>
       </w:r>
       <w:r>
         <w:t xml:space="preserve">.</w:t>
@@ -174,7 +168,7 @@
         <w:pStyle w:val="BodyText"/>
       </w:pPr>
       <w:r>
-        <w:t xml:space="preserve">This study addresses a methodological gap in biomedical informatics: how to rigorously benchmark knowledge graph (KG) contributions to machine learning models for gene perturbation prediction. Using GEARS-style spectral decomposition with ridge regression, we evaluated 11 KG variants across 10 independent train/test splits, with paired statistical tests and two causal ablation designs.</w:t>
+        <w:t xml:space="preserve">This manuscript presents RA-PainKG, a tissue-contextualized knowledge graph that fills a specific gap in the biomedical database landscape: a resource that integrates curated pain gene annotations with multimodal biomedical data, systematically documents knowledge gaps, and provides transparent benchmark validation.</w:t>
       </w:r>
     </w:p>
     <w:p>
@@ -182,7 +176,23 @@
         <w:pStyle w:val="BodyText"/>
       </w:pPr>
       <w:r>
-        <w:t xml:space="preserve">The key methodological findings are:</w:t>
+        <w:t xml:space="preserve">Three contributions are of particular relevance to the</w:t>
+      </w:r>
+      <w:r>
+        <w:t xml:space="preserve"> </w:t>
+      </w:r>
+      <w:r>
+        <w:rPr>
+          <w:i/>
+          <w:iCs/>
+        </w:rPr>
+        <w:t xml:space="preserve">Database</w:t>
+      </w:r>
+      <w:r>
+        <w:t xml:space="preserve"> </w:t>
+      </w:r>
+      <w:r>
+        <w:t xml:space="preserve">readership:</w:t>
       </w:r>
     </w:p>
     <w:p>
@@ -197,13 +207,13 @@
           <w:b/>
           <w:bCs/>
         </w:rPr>
-        <w:t xml:space="preserve">Single-split evaluation produces artifacts.</w:t>
+        <w:t xml:space="preserve">Resource construction with systematic gap documentation.</w:t>
       </w:r>
       <w:r>
         <w:t xml:space="preserve"> </w:t>
       </w:r>
       <w:r>
-        <w:t xml:space="preserve">We document a case where RA-PainKG (a disease-specific KG for rheumatoid arthritis pain signaling) appeared to outperform Gene Ontology under one split (pain r = 0.558 vs 0.481) but the effect reversed under multi-split averaging (0.503 vs 0.542). This demonstrates that split-level statistics are essential for reliable KG benchmarking.</w:t>
+        <w:t xml:space="preserve">RA-PainKG integrates PrimeKG v1.0, GTEx v8 tissue expression (54 tissues), and manual curation of nine pain signaling pathways into a dual-track framework (Track A: immune-inflammation, Track B: nociception). Critically, we document 72 core pain genes (37.5%) absent from PrimeKG-a transparency practice that is uncommon in biomedical database publications but essential for honest resource development.</w:t>
       </w:r>
     </w:p>
     <w:p>
@@ -218,13 +228,13 @@
           <w:b/>
           <w:bCs/>
         </w:rPr>
-        <w:t xml:space="preserve">Causal evidence via ablation.</w:t>
+        <w:t xml:space="preserve">Open, reusable formats.</w:t>
       </w:r>
       <w:r>
         <w:t xml:space="preserve"> </w:t>
       </w:r>
       <w:r>
-        <w:t xml:space="preserve">Degree-preserving randomization of RA-PainKG produces statistically indistinguishable performance (p = 0.41–0.83), establishing that graph connectivity—not edge semantics—drives prediction in linear spectral embedding models.</w:t>
+        <w:t xml:space="preserve">The graph is provided in GraphML, CSV, and Python pickle formats with complete construction source code under the MIT license. The modular pipeline enables re-generation with updated input resources.</w:t>
       </w:r>
     </w:p>
     <w:p>
@@ -239,13 +249,13 @@
           <w:b/>
           <w:bCs/>
         </w:rPr>
-        <w:t xml:space="preserve">Open-source benchmark framework.</w:t>
+        <w:t xml:space="preserve">Transparent benchmark validation with boundary conditions.</w:t>
       </w:r>
       <w:r>
         <w:t xml:space="preserve"> </w:t>
       </w:r>
       <w:r>
-        <w:t xml:space="preserve">We provide a complete multi-split ablation benchmark with paired t-tests, Kendall’s W ranking consistency, and sensitivity analyses, along with all code and data at https://github.com/yyx-4113/ra-painkg.</w:t>
+        <w:t xml:space="preserve">Validation across 11 KG variants establishes honest performance characterization rather than inflated claims, including explicit documentation of test system limitations (K562 cells express only 26.7% of pain genes).</w:t>
       </w:r>
     </w:p>
     <w:p>
@@ -253,7 +263,20 @@
         <w:pStyle w:val="FirstParagraph"/>
       </w:pPr>
       <w:r>
-        <w:t xml:space="preserve">We believe this manuscript aligns with JBI’s scope in biomedical informatics methodology, specifically addressing evaluation standards for knowledge graph integration in machine learning pipelines.</w:t>
+        <w:t xml:space="preserve">We believe this manuscript aligns with</w:t>
+      </w:r>
+      <w:r>
+        <w:t xml:space="preserve"> </w:t>
+      </w:r>
+      <w:r>
+        <w:rPr>
+          <w:i/>
+          <w:iCs/>
+        </w:rPr>
+        <w:t xml:space="preserve">Database</w:t>
+      </w:r>
+      <w:r>
+        <w:t xml:space="preserve">’s scope as a resource paper that combines rigorous construction methodology, systematic coverage analysis, and transparent validation.</w:t>
       </w:r>
     </w:p>
     <w:p>
@@ -301,7 +324,7 @@
         </w:numPr>
       </w:pPr>
       <w:r>
-        <w:t xml:space="preserve">This study uses exclusively publicly available data (Norman et al., 2019; DOI: 10.7910/DVN/R9JDLS). No new data involving human subjects were collected.</w:t>
+        <w:t xml:space="preserve">This study uses exclusively publicly available data. No new data involving human subjects were collected.</w:t>
       </w:r>
     </w:p>
     <w:p>
@@ -313,97 +336,35 @@
         </w:numPr>
       </w:pPr>
       <w:r>
-        <w:t xml:space="preserve">All code, processed data, and benchmark results are publicly available under the MIT license at https://github.com/yyx-4113/ra-painkg.</w:t>
+        <w:t xml:space="preserve">All code, graph files, and documentation are publicly available under the MIT license at https://github.com/yyx-4113/ra-painkg.</w:t>
       </w:r>
     </w:p>
     <w:p>
       <w:pPr>
         <w:pStyle w:val="FirstParagraph"/>
+      </w:pPr>
+      <w:r>
+        <w:t xml:space="preserve">Thank you for considering this manuscript. I look forward to your response.</w:t>
+      </w:r>
+    </w:p>
+    <w:p>
+      <w:pPr>
+        <w:pStyle w:val="BodyText"/>
+      </w:pPr>
+      <w:r>
+        <w:t xml:space="preserve">Sincerely,</w:t>
+      </w:r>
+    </w:p>
+    <w:p>
+      <w:pPr>
+        <w:pStyle w:val="BodyText"/>
       </w:pPr>
       <w:r>
         <w:rPr>
           <w:b/>
           <w:bCs/>
         </w:rPr>
-        <w:t xml:space="preserve">Suggested Reviewers</w:t>
-      </w:r>
-      <w:r>
-        <w:t xml:space="preserve"> </w:t>
-      </w:r>
-      <w:r>
-        <w:t xml:space="preserve">(optional)</w:t>
-      </w:r>
-    </w:p>
-    <w:p>
-      <w:pPr>
-        <w:pStyle w:val="Compact"/>
-        <w:numPr>
-          <w:ilvl w:val="0"/>
-          <w:numId w:val="1003"/>
-        </w:numPr>
-      </w:pPr>
-      <w:r>
-        <w:t xml:space="preserve">A researcher with expertise in knowledge graph benchmarking and biomedical network analysis</w:t>
-      </w:r>
-    </w:p>
-    <w:p>
-      <w:pPr>
-        <w:pStyle w:val="Compact"/>
-        <w:numPr>
-          <w:ilvl w:val="0"/>
-          <w:numId w:val="1003"/>
-        </w:numPr>
-      </w:pPr>
-      <w:r>
-        <w:t xml:space="preserve">A researcher with expertise in single-cell perturbation prediction and GEARS methodology</w:t>
-      </w:r>
-    </w:p>
-    <w:p>
-      <w:pPr>
-        <w:pStyle w:val="Compact"/>
-        <w:numPr>
-          <w:ilvl w:val="0"/>
-          <w:numId w:val="1003"/>
-        </w:numPr>
-      </w:pPr>
-      <w:r>
-        <w:t xml:space="preserve">A researcher with expertise in biomedical informatics evaluation standards</w:t>
-      </w:r>
-    </w:p>
-    <w:p>
-      <w:pPr>
-        <w:pStyle w:val="FirstParagraph"/>
-      </w:pPr>
-      <w:r>
-        <w:t xml:space="preserve">Thank you for considering this manuscript. I look forward to your response.</w:t>
-      </w:r>
-    </w:p>
-    <w:p>
-      <w:pPr>
-        <w:pStyle w:val="BodyText"/>
-      </w:pPr>
-      <w:r>
-        <w:t xml:space="preserve">Sincerely,</w:t>
-      </w:r>
-    </w:p>
-    <w:p>
-      <w:pPr>
-        <w:pStyle w:val="BodyText"/>
-      </w:pPr>
-      <w:r>
-        <w:rPr>
-          <w:b/>
-          <w:bCs/>
-        </w:rPr>
-        <w:t xml:space="preserve">Yongxin Yang </w:t>
-      </w:r>
-      <w:r>
-        <w:rPr>
-          <w:rFonts w:hint="eastAsia"/>
-          <w:b/>
-          <w:bCs/>
-        </w:rPr>
-        <w:t xml:space="preserve">(杨永新)</w:t>
+        <w:t xml:space="preserve">Yongxin Yang</w:t>
       </w:r>
     </w:p>
     <w:p>
@@ -413,530 +374,7 @@
         </w:pict>
       </w:r>
     </w:p>
-    <w:bookmarkStart w:id="20" w:name="submission-package-checklist"/>
-    <w:p>
-      <w:pPr>
-        <w:pStyle w:val="Heading2"/>
-      </w:pPr>
-      <w:r>
-        <w:t xml:space="preserve">Submission Package Checklist</w:t>
-      </w:r>
-    </w:p>
-    <w:tbl>
-      <w:tblPr>
-        <w:tblStyle w:val="Table"/>
-        <w:tblW w:type="pct" w:w="5000"/>
-        <w:tblLayout w:type="fixed"/>
-        <w:tblLook w:firstRow="1" w:lastRow="0" w:firstColumn="0" w:lastColumn="0" w:noHBand="0" w:noVBand="0" w:val="0020"/>
-      </w:tblPr>
-      <w:tblGrid>
-        <w:gridCol w:w="2376"/>
-        <w:gridCol w:w="2376"/>
-        <w:gridCol w:w="3168"/>
-      </w:tblGrid>
-      <w:tr>
-        <w:trPr>
-          <w:tblHeader w:val="on"/>
-        </w:trPr>
-        <w:tc>
-          <w:tcPr/>
-          <w:p>
-            <w:pPr>
-              <w:pStyle w:val="Compact"/>
-            </w:pPr>
-            <w:r>
-              <w:t xml:space="preserve">Item</w:t>
-            </w:r>
-          </w:p>
-        </w:tc>
-        <w:tc>
-          <w:tcPr/>
-          <w:p>
-            <w:pPr>
-              <w:pStyle w:val="Compact"/>
-            </w:pPr>
-            <w:r>
-              <w:t xml:space="preserve">File</w:t>
-            </w:r>
-          </w:p>
-        </w:tc>
-        <w:tc>
-          <w:tcPr/>
-          <w:p>
-            <w:pPr>
-              <w:pStyle w:val="Compact"/>
-            </w:pPr>
-            <w:r>
-              <w:t xml:space="preserve">Status</w:t>
-            </w:r>
-          </w:p>
-        </w:tc>
-      </w:tr>
-      <w:tr>
-        <w:tc>
-          <w:tcPr/>
-          <w:p>
-            <w:pPr>
-              <w:pStyle w:val="Compact"/>
-            </w:pPr>
-            <w:r>
-              <w:t xml:space="preserve">Manuscript</w:t>
-            </w:r>
-          </w:p>
-        </w:tc>
-        <w:tc>
-          <w:tcPr/>
-          <w:p>
-            <w:pPr>
-              <w:pStyle w:val="Compact"/>
-            </w:pPr>
-            <w:r>
-              <w:rPr>
-                <w:rStyle w:val="VerbatimChar"/>
-              </w:rPr>
-              <w:t xml:space="preserve">benchmark/methods_paper.md</w:t>
-            </w:r>
-          </w:p>
-        </w:tc>
-        <w:tc>
-          <w:tcPr/>
-          <w:p>
-            <w:pPr>
-              <w:pStyle w:val="Compact"/>
-            </w:pPr>
-            <w:r>
-              <w:t xml:space="preserve">✅ Ready</w:t>
-            </w:r>
-          </w:p>
-        </w:tc>
-      </w:tr>
-      <w:tr>
-        <w:tc>
-          <w:tcPr/>
-          <w:p>
-            <w:pPr>
-              <w:pStyle w:val="Compact"/>
-            </w:pPr>
-            <w:r>
-              <w:t xml:space="preserve">Cover Letter</w:t>
-            </w:r>
-          </w:p>
-        </w:tc>
-        <w:tc>
-          <w:tcPr/>
-          <w:p>
-            <w:pPr>
-              <w:pStyle w:val="Compact"/>
-            </w:pPr>
-            <w:r>
-              <w:rPr>
-                <w:rStyle w:val="VerbatimChar"/>
-              </w:rPr>
-              <w:t xml:space="preserve">benchmark/cover_letter.md</w:t>
-            </w:r>
-          </w:p>
-        </w:tc>
-        <w:tc>
-          <w:tcPr/>
-          <w:p>
-            <w:pPr>
-              <w:pStyle w:val="Compact"/>
-            </w:pPr>
-            <w:r>
-              <w:t xml:space="preserve">✅ This file</w:t>
-            </w:r>
-          </w:p>
-        </w:tc>
-      </w:tr>
-      <w:tr>
-        <w:tc>
-          <w:tcPr/>
-          <w:p>
-            <w:pPr>
-              <w:pStyle w:val="Compact"/>
-            </w:pPr>
-            <w:r>
-              <w:t xml:space="preserve">Supplementary Table S1</w:t>
-            </w:r>
-          </w:p>
-        </w:tc>
-        <w:tc>
-          <w:tcPr/>
-          <w:p>
-            <w:pPr>
-              <w:pStyle w:val="Compact"/>
-            </w:pPr>
-            <w:r>
-              <w:rPr>
-                <w:rStyle w:val="VerbatimChar"/>
-              </w:rPr>
-              <w:t xml:space="preserve">benchmark/results/supplementary_table_S1.md</w:t>
-            </w:r>
-          </w:p>
-        </w:tc>
-        <w:tc>
-          <w:tcPr/>
-          <w:p>
-            <w:pPr>
-              <w:pStyle w:val="Compact"/>
-            </w:pPr>
-            <w:r>
-              <w:t xml:space="preserve">✅</w:t>
-            </w:r>
-          </w:p>
-        </w:tc>
-      </w:tr>
-      <w:tr>
-        <w:tc>
-          <w:tcPr/>
-          <w:p>
-            <w:pPr>
-              <w:pStyle w:val="Compact"/>
-            </w:pPr>
-            <w:r>
-              <w:t xml:space="preserve">Supplementary Table S2</w:t>
-            </w:r>
-          </w:p>
-        </w:tc>
-        <w:tc>
-          <w:tcPr/>
-          <w:p>
-            <w:pPr>
-              <w:pStyle w:val="Compact"/>
-            </w:pPr>
-            <w:r>
-              <w:rPr>
-                <w:rStyle w:val="VerbatimChar"/>
-              </w:rPr>
-              <w:t xml:space="preserve">benchmark/results/supplementary_table_S2.md</w:t>
-            </w:r>
-          </w:p>
-        </w:tc>
-        <w:tc>
-          <w:tcPr/>
-          <w:p>
-            <w:pPr>
-              <w:pStyle w:val="Compact"/>
-            </w:pPr>
-            <w:r>
-              <w:t xml:space="preserve">✅</w:t>
-            </w:r>
-          </w:p>
-        </w:tc>
-      </w:tr>
-      <w:tr>
-        <w:tc>
-          <w:tcPr/>
-          <w:p>
-            <w:pPr>
-              <w:pStyle w:val="Compact"/>
-            </w:pPr>
-            <w:r>
-              <w:t xml:space="preserve">Supplementary Table S3</w:t>
-            </w:r>
-          </w:p>
-        </w:tc>
-        <w:tc>
-          <w:tcPr/>
-          <w:p>
-            <w:pPr>
-              <w:pStyle w:val="Compact"/>
-            </w:pPr>
-            <w:r>
-              <w:rPr>
-                <w:rStyle w:val="VerbatimChar"/>
-              </w:rPr>
-              <w:t xml:space="preserve">benchmark/results/supplementary_table_S3.md</w:t>
-            </w:r>
-          </w:p>
-        </w:tc>
-        <w:tc>
-          <w:tcPr/>
-          <w:p>
-            <w:pPr>
-              <w:pStyle w:val="Compact"/>
-            </w:pPr>
-            <w:r>
-              <w:t xml:space="preserve">✅</w:t>
-            </w:r>
-          </w:p>
-        </w:tc>
-      </w:tr>
-      <w:tr>
-        <w:tc>
-          <w:tcPr/>
-          <w:p>
-            <w:pPr>
-              <w:pStyle w:val="Compact"/>
-            </w:pPr>
-            <w:r>
-              <w:t xml:space="preserve">Supplementary Table S4</w:t>
-            </w:r>
-          </w:p>
-        </w:tc>
-        <w:tc>
-          <w:tcPr/>
-          <w:p>
-            <w:pPr>
-              <w:pStyle w:val="Compact"/>
-            </w:pPr>
-            <w:r>
-              <w:rPr>
-                <w:rStyle w:val="VerbatimChar"/>
-              </w:rPr>
-              <w:t xml:space="preserve">benchmark/results/supplementary_table_S4.md</w:t>
-            </w:r>
-          </w:p>
-        </w:tc>
-        <w:tc>
-          <w:tcPr/>
-          <w:p>
-            <w:pPr>
-              <w:pStyle w:val="Compact"/>
-            </w:pPr>
-            <w:r>
-              <w:t xml:space="preserve">✅</w:t>
-            </w:r>
-          </w:p>
-        </w:tc>
-      </w:tr>
-      <w:tr>
-        <w:tc>
-          <w:tcPr/>
-          <w:p>
-            <w:pPr>
-              <w:pStyle w:val="Compact"/>
-            </w:pPr>
-            <w:r>
-              <w:t xml:space="preserve">Supplementary Table S5</w:t>
-            </w:r>
-          </w:p>
-        </w:tc>
-        <w:tc>
-          <w:tcPr/>
-          <w:p>
-            <w:pPr>
-              <w:pStyle w:val="Compact"/>
-            </w:pPr>
-            <w:r>
-              <w:rPr>
-                <w:rStyle w:val="VerbatimChar"/>
-              </w:rPr>
-              <w:t xml:space="preserve">benchmark/results/supplementary_table_S5.md</w:t>
-            </w:r>
-          </w:p>
-        </w:tc>
-        <w:tc>
-          <w:tcPr/>
-          <w:p>
-            <w:pPr>
-              <w:pStyle w:val="Compact"/>
-            </w:pPr>
-            <w:r>
-              <w:t xml:space="preserve">✅</w:t>
-            </w:r>
-          </w:p>
-        </w:tc>
-      </w:tr>
-      <w:tr>
-        <w:tc>
-          <w:tcPr/>
-          <w:p>
-            <w:pPr>
-              <w:pStyle w:val="Compact"/>
-            </w:pPr>
-            <w:r>
-              <w:t xml:space="preserve">Code &amp; Data Repository</w:t>
-            </w:r>
-          </w:p>
-        </w:tc>
-        <w:tc>
-          <w:tcPr/>
-          <w:p>
-            <w:pPr>
-              <w:pStyle w:val="Compact"/>
-            </w:pPr>
-            <w:r>
-              <w:t xml:space="preserve">https://github.com/yyx-4113/ra-painkg</w:t>
-            </w:r>
-          </w:p>
-        </w:tc>
-        <w:tc>
-          <w:tcPr/>
-          <w:p>
-            <w:pPr>
-              <w:pStyle w:val="Compact"/>
-            </w:pPr>
-            <w:r>
-              <w:t xml:space="preserve">✅ Public</w:t>
-            </w:r>
-          </w:p>
-        </w:tc>
-      </w:tr>
-      <w:tr>
-        <w:tc>
-          <w:tcPr/>
-          <w:p>
-            <w:pPr>
-              <w:pStyle w:val="Compact"/>
-            </w:pPr>
-            <w:r>
-              <w:t xml:space="preserve">Figures</w:t>
-            </w:r>
-          </w:p>
-        </w:tc>
-        <w:tc>
-          <w:tcPr/>
-          <w:p>
-            <w:pPr>
-              <w:pStyle w:val="Compact"/>
-            </w:pPr>
-            <w:r>
-              <w:rPr>
-                <w:rStyle w:val="VerbatimChar"/>
-              </w:rPr>
-              <w:t xml:space="preserve">output/fig1-6.pdf</w:t>
-            </w:r>
-          </w:p>
-        </w:tc>
-        <w:tc>
-          <w:tcPr/>
-          <w:p>
-            <w:pPr>
-              <w:pStyle w:val="Compact"/>
-            </w:pPr>
-            <w:r>
-              <w:t xml:space="preserve">✅ Ready</w:t>
-            </w:r>
-          </w:p>
-        </w:tc>
-      </w:tr>
-      <w:tr>
-        <w:tc>
-          <w:tcPr/>
-          <w:p>
-            <w:pPr>
-              <w:pStyle w:val="Compact"/>
-            </w:pPr>
-            <w:r>
-              <w:t xml:space="preserve">Ethics Statement</w:t>
-            </w:r>
-          </w:p>
-        </w:tc>
-        <w:tc>
-          <w:tcPr/>
-          <w:p>
-            <w:pPr>
-              <w:pStyle w:val="Compact"/>
-            </w:pPr>
-            <w:r>
-              <w:t xml:space="preserve">Included in manuscript</w:t>
-            </w:r>
-          </w:p>
-        </w:tc>
-        <w:tc>
-          <w:tcPr/>
-          <w:p>
-            <w:pPr>
-              <w:pStyle w:val="Compact"/>
-            </w:pPr>
-            <w:r>
-              <w:t xml:space="preserve">✅</w:t>
-            </w:r>
-          </w:p>
-        </w:tc>
-      </w:tr>
-      <w:tr>
-        <w:tc>
-          <w:tcPr/>
-          <w:p>
-            <w:pPr>
-              <w:pStyle w:val="Compact"/>
-            </w:pPr>
-            <w:r>
-              <w:t xml:space="preserve">Competing Interests</w:t>
-            </w:r>
-          </w:p>
-        </w:tc>
-        <w:tc>
-          <w:tcPr/>
-          <w:p>
-            <w:pPr>
-              <w:pStyle w:val="Compact"/>
-            </w:pPr>
-            <w:r>
-              <w:t xml:space="preserve">Included in manuscript</w:t>
-            </w:r>
-          </w:p>
-        </w:tc>
-        <w:tc>
-          <w:tcPr/>
-          <w:p>
-            <w:pPr>
-              <w:pStyle w:val="Compact"/>
-            </w:pPr>
-            <w:r>
-              <w:t xml:space="preserve">✅</w:t>
-            </w:r>
-          </w:p>
-        </w:tc>
-      </w:tr>
-      <w:tr>
-        <w:tc>
-          <w:tcPr/>
-          <w:p>
-            <w:pPr>
-              <w:pStyle w:val="Compact"/>
-            </w:pPr>
-            <w:r>
-              <w:t xml:space="preserve">Author Contributions</w:t>
-            </w:r>
-          </w:p>
-        </w:tc>
-        <w:tc>
-          <w:tcPr/>
-          <w:p>
-            <w:pPr>
-              <w:pStyle w:val="Compact"/>
-            </w:pPr>
-            <w:r>
-              <w:t xml:space="preserve">Included in manuscript</w:t>
-            </w:r>
-          </w:p>
-        </w:tc>
-        <w:tc>
-          <w:tcPr/>
-          <w:p>
-            <w:pPr>
-              <w:pStyle w:val="Compact"/>
-            </w:pPr>
-            <w:r>
-              <w:t xml:space="preserve">✅</w:t>
-            </w:r>
-          </w:p>
-        </w:tc>
-      </w:tr>
-    </w:tbl>
-    <w:p>
-      <w:pPr>
-        <w:pStyle w:val="BodyText"/>
-      </w:pPr>
-      <w:r>
-        <w:rPr>
-          <w:b/>
-          <w:bCs/>
-        </w:rPr>
-        <w:t xml:space="preserve">JBI Submission URL:</w:t>
-      </w:r>
-      <w:r>
-        <w:t xml:space="preserve"> </w:t>
-      </w:r>
-      <w:r>
-        <w:t xml:space="preserve">https://www.editorialmanager.com/jbi/</w:t>
-      </w:r>
-    </w:p>
     <w:bookmarkEnd w:id="20"/>
-    <w:bookmarkEnd w:id="21"/>
     <w:sectPr>
       <w:footnotePr>
         <w:numRestart w:val="eachSect"/>
@@ -1270,36 +708,6 @@
   </w:num>
   <w:num w:numId="1002">
     <w:abstractNumId w:val="991"/>
-  </w:num>
-  <w:num w:numId="1003">
-    <w:abstractNumId w:val="99411"/>
-    <w:lvlOverride w:ilvl="0">
-      <w:startOverride w:val="1"/>
-    </w:lvlOverride>
-    <w:lvlOverride w:ilvl="1">
-      <w:startOverride w:val="1"/>
-    </w:lvlOverride>
-    <w:lvlOverride w:ilvl="2">
-      <w:startOverride w:val="1"/>
-    </w:lvlOverride>
-    <w:lvlOverride w:ilvl="3">
-      <w:startOverride w:val="1"/>
-    </w:lvlOverride>
-    <w:lvlOverride w:ilvl="4">
-      <w:startOverride w:val="1"/>
-    </w:lvlOverride>
-    <w:lvlOverride w:ilvl="5">
-      <w:startOverride w:val="1"/>
-    </w:lvlOverride>
-    <w:lvlOverride w:ilvl="6">
-      <w:startOverride w:val="1"/>
-    </w:lvlOverride>
-    <w:lvlOverride w:ilvl="7">
-      <w:startOverride w:val="1"/>
-    </w:lvlOverride>
-    <w:lvlOverride w:ilvl="8">
-      <w:startOverride w:val="1"/>
-    </w:lvlOverride>
   </w:num>
 </w:numbering>
 </file>

</xml_diff>